<commit_message>
Fix diagram misalignment in course design report
- 图16 数据库架构图: rebuilt as clean 4x2 grid, no box overlap,
  FK arrows routed through inter-row gap (child FK -> parent PK)
- 图3 客户端架构图: separated overlapping sub-function boxes
- 图6 登录流程图: moved 失败/成功 branch labels off the boxes
- 图15 群聊广播: white background behind annotation label
- verified all referenced function names against actual source

Co-Authored-By: Claude Opus 4.8 <noreply@anthropic.com>
Claude-Session: https://claude.ai/code/session_01S11zuSKCz6xKmW9UNTA1BW
</commit_message>
<xml_diff>
--- a/chat_linux_report_v2.docx
+++ b/chat_linux_report_v2.docx
@@ -4160,7 +4160,7 @@
       <w:r>
         <w:drawing>
           <wp:inline xmlns:a="http://schemas.openxmlformats.org/drawingml/2006/main" xmlns:pic="http://schemas.openxmlformats.org/drawingml/2006/picture">
-            <wp:extent cx="5400000" cy="3143960"/>
+            <wp:extent cx="5400000" cy="3615101"/>
             <wp:docPr id="16" name="Picture 16"/>
             <wp:cNvGraphicFramePr>
               <a:graphicFrameLocks noChangeAspect="1"/>
@@ -4181,7 +4181,7 @@
                   <pic:spPr>
                     <a:xfrm>
                       <a:off x="0" y="0"/>
-                      <a:ext cx="5400000" cy="3143960"/>
+                      <a:ext cx="5400000" cy="3615101"/>
                     </a:xfrm>
                     <a:prstGeom prst="rect"/>
                   </pic:spPr>

</xml_diff>